<commit_message>
ACP 0900193-90: v6 — cláusula de ratificação sem marcador temporal e fundada só no CC 662 p.ú.; Evento 280 dos autos de origem
Co-Authored-By: Claude Fable 5.1 <noreply@anthropic.com>
Claude-Session: https://claude.ai/code/session_01CCVbA1mc4UdnaFNsukuTYT
</commit_message>
<xml_diff>
--- a/juridico/ACP-0900193-90.2016.8.24.0064/2026-09-02-cumprimento-ev25/pecas/02-procuracao-ad-judicia.docx
+++ b/juridico/ACP-0900193-90.2016.8.24.0064/2026-09-02-cumprimento-ev25/pecas/02-procuracao-ad-judicia.docx
@@ -147,7 +147,7 @@
           <w:sz w:val="24"/>
           <w:szCs w:val="24"/>
         </w:rPr>
-        <w:t xml:space="preserve">Confere-lhe, ainda, de modo expresso e especial (CPC, art. 105), os poderes para receber citação, confessar, reconhecer a procedência do pedido, transigir — inclusive por meio de termo de ajustamento de conduta ou compromisso equivalente —, desistir — inclusive de pedidos, requerimentos e incidentes formulados no curso dos processos, como o requerimento de gratuidade da justiça formulado nas razões da apelação (Evento 280) —, renunciar ao direito sobre o qual se funda a ação, receber e dar quitação, firmar compromisso, recolher custas e preparo, requerer que as intimações sejam feitas exclusivamente em seu nome e substabelecer este mandato, no todo ou em parte, com ou sem reserva de poderes.</w:t>
+        <w:t xml:space="preserve">Confere-lhe, ainda, de modo expresso e especial (CPC, art. 105), os poderes para receber citação, confessar, reconhecer a procedência do pedido, transigir — inclusive por meio de termo de ajustamento de conduta ou compromisso equivalente —, desistir — inclusive de pedidos, requerimentos e incidentes formulados no curso dos processos, como o requerimento de gratuidade da justiça formulado nas razões da apelação (Evento 280 dos autos de origem) —, renunciar ao direito sobre o qual se funda a ação, receber e dar quitação, firmar compromisso, recolher custas e preparo, requerer que as intimações sejam feitas exclusivamente em seu nome e substabelecer este mandato, no todo ou em parte, com ou sem reserva de poderes.</w:t>
       </w:r>
     </w:p>
     <w:p>
@@ -179,7 +179,7 @@
           <w:sz w:val="24"/>
           <w:szCs w:val="24"/>
         </w:rPr>
-        <w:t xml:space="preserve">A OUTORGANTE ratifica expressamente, para todos os fins de direito (Código Civil, art. 662, parágrafo único; CPC, art. 104, § 2º), todos os atos, processuais e extraprocessuais, praticados em seu nome e no seu interesse pelo OUTORGADO nos autos da Ação Civil Pública n. 0900193-90.2016.8.24.0064, da respectiva Apelação Cível e do incidente n. 5049926-11.2026.8.24.0000, desde 7 de fevereiro de 2020 até a data deste instrumento, em especial: a manifestação e os documentos do Evento 257 dos autos de origem (22/01/2025); a Apelação Cível do Evento 280 (11/05/2026); a petição inicial e as demais manifestações do incidente n. 5049926-11.2026.8.24.0000 (junho de 2026); os memoriais do Evento 17 da Apelação Cível (14/08/2026); as diligências de 02/09/2026 perante a Seção de Custas Judiciais do Tribunal de Justiça de Santa Catarina, a emissão da guia de preparo recursal (Eventos 31 e 32 da Apelação Cível) e o seu recolhimento, realizado na mesma data; e a petição de cumprimento do despacho do Evento 25 da Apelação Cível, que este instrumento acompanha. Declara que tais atos foram praticados por procurador de sua confiança e no seu interesse e que produzem efeitos desde as respectivas datas.</w:t>
+        <w:t xml:space="preserve">Em reforço, e para que não paire dúvida quanto à cadeia de representação, a OUTORGANTE ratifica expressamente, para todos os fins de direito (Código Civil, art. 662, parágrafo único), todos os atos, processuais e extraprocessuais, praticados em seu nome e no seu interesse pelo OUTORGADO, até a data deste instrumento, nos autos da Ação Civil Pública n. 0900193-90.2016.8.24.0064 (Vara da Fazenda Pública da Comarca de São José/SC), da Apelação Cível de mesmo número (2ª Câmara de Direito Público do Tribunal de Justiça de Santa Catarina) e do incidente n. 5049926-11.2026.8.24.0000, em especial: a manifestação e os documentos do Evento 257 dos autos de origem (22/01/2025); a Apelação Cível do Evento 280 (11/05/2026); a petição inicial e as demais manifestações do incidente n. 5049926-11.2026.8.24.0000 (junho de 2026); os memoriais do Evento 17 da Apelação Cível (14/08/2026); as diligências de 02/09/2026 perante a Seção de Custas Judiciais do Tribunal de Justiça de Santa Catarina, a emissão da guia de preparo recursal (Eventos 31 e 32 da Apelação Cível) e o seu recolhimento, realizado na mesma data; e a petição de cumprimento do despacho do Evento 25 da Apelação Cível, que este instrumento acompanha. Declara que tais atos foram praticados por procurador de sua confiança e no seu interesse e que produzem efeitos desde as respectivas datas.</w:t>
       </w:r>
     </w:p>
     <w:p>

</xml_diff>

<commit_message>
ACP 0900193-90: v7 — procuração com enumeração nominativa da ratificação, identificação completa da apelação, Termo JUCESC e cláusula do CC 117 reescrita
Co-Authored-By: Claude Fable 5.1 <noreply@anthropic.com>
Claude-Session: https://claude.ai/code/session_01CCVbA1mc4UdnaFNsukuTYT
</commit_message>
<xml_diff>
--- a/juridico/ACP-0900193-90.2016.8.24.0064/2026-09-02-cumprimento-ev25/pecas/02-procuracao-ad-judicia.docx
+++ b/juridico/ACP-0900193-90.2016.8.24.0064/2026-09-02-cumprimento-ev25/pecas/02-procuracao-ad-judicia.docx
@@ -40,7 +40,7 @@
           <w:sz w:val="24"/>
           <w:szCs w:val="24"/>
         </w:rPr>
-        <w:t xml:space="preserve"> ANTUNELLI E ANTUNELLI INSTITUIÇÃO DE IDOSOS LTDA., pessoa jurídica de direito privado, inscrita no CNPJ sob o n. 02.145.891/0001-08 e na Junta Comercial do Estado de Santa Catarina sob o NIRE 42.2.0661273-1, com sede na Rua Vergilino Domingos da Silva, n. 1.100, conforme registro na JUCESC, e estabelecimento no n. 1.003 da mesma via, Loteamento Canaã, Bairro Serraria, São José/SC, CEP 88.115-170, neste ato representada, na forma da Cláusula Quinta de sua Sétima Alteração Contratual (transformação em sociedade limitada), arquivada na JUCESC em 08/06/2021, por seu sócio único e administrador GABRIEL FABRIZIO DO ESPÍRITO SANTO, brasileiro, divorciado, empresário e advogado, portador da cédula de identidade RG n. 7.638.245 SSP/SC, inscrito no CPF sob o n. 544.074.601-30, residente e domiciliado na Rua Vergilino Domingos da Silva, n. 1.100, Bairro Serraria, São José/SC, CEP 88.115-170.</w:t>
+        <w:t xml:space="preserve"> ANTUNELLI E ANTUNELLI INSTITUIÇÃO DE IDOSOS LTDA., pessoa jurídica de direito privado, inscrita no CNPJ sob o n. 02.145.891/0001-08 e na Junta Comercial do Estado de Santa Catarina sob o NIRE 42.2.0661273-1, com sede na Rua Vergilino Domingos da Silva, n. 1.100, conforme registro na JUCESC, e estabelecimento no n. 1.003 da mesma via, Loteamento Canaã, Bairro Serraria, São José/SC, CEP 88.115-170, neste ato representada, na forma da Cláusula Quinta de sua Sétima Alteração do Contrato Social (transformação em sociedade limitada), arquivada na JUCESC em 08/06/2021 sob o Termo de Autenticação n. 218.834.454, por seu sócio único e administrador GABRIEL FABRIZIO DO ESPÍRITO SANTO, brasileiro, divorciado, empresário e advogado, portador da cédula de identidade RG n. 7.638.245 SSP/SC, inscrito no CPF sob o n. 544.074.601-30, residente e domiciliado na Rua Vergilino Domingos da Silva, n. 1.100, Bairro Serraria, São José/SC, CEP 88.115-170.</w:t>
       </w:r>
     </w:p>
     <w:p>
@@ -115,7 +115,7 @@
           <w:sz w:val="24"/>
           <w:szCs w:val="24"/>
         </w:rPr>
-        <w:t xml:space="preserve">, para o foro em geral, em qualquer juízo, instância ou tribunal, inclusive perante o Superior Tribunal de Justiça e o Supremo Tribunal Federal, especialmente para representá-la nos autos da Ação Civil Pública n. 0900193-90.2016.8.24.0064, em trâmite na Vara da Fazenda Pública da Comarca de São José/SC, na Apelação Cível correspondente perante o Tribunal de Justiça de Santa Catarina, no incidente n. 5049926-11.2026.8.24.0000 (pedido de atribuição de efeito suspensivo à apelação) e em todos os recursos, incidentes, execuções e fases deles decorrentes, inclusive o cumprimento de sentença (CPC, art. 105, § 4º) e os recursos às instâncias superiores, podendo propor e contestar ações, interpor e responder recursos, apresentar ou deixar de apresentar contrarrazões, requerer, alegar e defender os direitos e interesses da OUTORGANTE, apresentar memoriais e realizar sustentação oral, requerer a habilitação e a desabilitação de procuradores no cadastro processual, acompanhar os feitos até final decisão e praticar todos os demais atos necessários ao fiel desempenho do mandato.</w:t>
+        <w:t xml:space="preserve">, para o foro em geral, em qualquer juízo, instância ou tribunal, inclusive perante o Superior Tribunal de Justiça e o Supremo Tribunal Federal, especialmente para representá-la nos autos da Ação Civil Pública n. 0900193-90.2016.8.24.0064, em trâmite na Vara da Fazenda Pública da Comarca de São José/SC, na Apelação Cível n. 0900193-90.2016.8.24.0064, em trâmite na 2ª Câmara de Direito Público do Tribunal de Justiça de Santa Catarina, no incidente n. 5049926-11.2026.8.24.0000 (pedido de atribuição de efeito suspensivo à apelação) e em todos os recursos, incidentes, execuções e fases deles decorrentes, inclusive o cumprimento de sentença (CPC, art. 105, § 4º) e os recursos às instâncias superiores, podendo propor e contestar ações, interpor e responder recursos, apresentar ou deixar de apresentar contrarrazões, requerer, alegar e defender os direitos e interesses da OUTORGANTE, apresentar memoriais e realizar sustentação oral, requerer a habilitação e a desabilitação de procuradores no cadastro processual, acompanhar os feitos até final decisão e praticar todos os demais atos necessários ao fiel desempenho do mandato.</w:t>
       </w:r>
     </w:p>
     <w:p>
@@ -147,7 +147,7 @@
           <w:sz w:val="24"/>
           <w:szCs w:val="24"/>
         </w:rPr>
-        <w:t xml:space="preserve">Confere-lhe, ainda, de modo expresso e especial (CPC, art. 105), os poderes para receber citação, confessar, reconhecer a procedência do pedido, transigir — inclusive por meio de termo de ajustamento de conduta ou compromisso equivalente —, desistir — inclusive de pedidos, requerimentos e incidentes formulados no curso dos processos, como o requerimento de gratuidade da justiça formulado nas razões da apelação (Evento 280 dos autos de origem) —, renunciar ao direito sobre o qual se funda a ação, receber e dar quitação, firmar compromisso, recolher custas e preparo, requerer que as intimações sejam feitas exclusivamente em seu nome e substabelecer este mandato, no todo ou em parte, com ou sem reserva de poderes.</w:t>
+        <w:t xml:space="preserve">Confere-lhe, ainda, de modo expresso e especial (CPC, art. 105, caput), os poderes para receber citação, confessar, reconhecer a procedência do pedido, transigir — inclusive por meio de termo de ajustamento de conduta ou compromisso equivalente —, desistir — inclusive de pedidos, requerimentos e incidentes formulados no curso dos processos, como o requerimento de gratuidade da justiça formulado nas razões da apelação (Evento 280 dos autos de origem) —, renunciar ao direito sobre o qual se funda a ação, receber e dar quitação, firmar compromisso, recolher custas e preparo, requerer que as intimações sejam feitas exclusivamente em seu nome e substabelecer este mandato, no todo ou em parte, com ou sem reserva de poderes.</w:t>
       </w:r>
     </w:p>
     <w:p>
@@ -179,7 +179,7 @@
           <w:sz w:val="24"/>
           <w:szCs w:val="24"/>
         </w:rPr>
-        <w:t xml:space="preserve">Em reforço, e para que não paire dúvida quanto à cadeia de representação, a OUTORGANTE ratifica expressamente, para todos os fins de direito (Código Civil, art. 662, parágrafo único), todos os atos, processuais e extraprocessuais, praticados em seu nome e no seu interesse pelo OUTORGADO, até a data deste instrumento, nos autos da Ação Civil Pública n. 0900193-90.2016.8.24.0064 (Vara da Fazenda Pública da Comarca de São José/SC), da Apelação Cível de mesmo número (2ª Câmara de Direito Público do Tribunal de Justiça de Santa Catarina) e do incidente n. 5049926-11.2026.8.24.0000, em especial: a manifestação e os documentos do Evento 257 dos autos de origem (22/01/2025); a Apelação Cível do Evento 280 (11/05/2026); a petição inicial e as demais manifestações do incidente n. 5049926-11.2026.8.24.0000 (junho de 2026); os memoriais do Evento 17 da Apelação Cível (14/08/2026); as diligências de 02/09/2026 perante a Seção de Custas Judiciais do Tribunal de Justiça de Santa Catarina, a emissão da guia de preparo recursal (Eventos 31 e 32 da Apelação Cível) e o seu recolhimento, realizado na mesma data; e a petição de cumprimento do despacho do Evento 25 da Apelação Cível, que este instrumento acompanha. Declara que tais atos foram praticados por procurador de sua confiança e no seu interesse e que produzem efeitos desde as respectivas datas.</w:t>
+        <w:t xml:space="preserve">Em reforço, e para que não paire dúvida quanto à cadeia de representação, a OUTORGANTE ratifica expressamente, para todos os fins de direito (Código Civil, art. 662, parágrafo único), todos os atos, processuais e extraprocessuais, praticados em seu nome e no seu interesse pelo OUTORGADO, até a data deste instrumento, nos autos da Ação Civil Pública n. 0900193-90.2016.8.24.0064 (Vara da Fazenda Pública da Comarca de São José/SC), da Apelação Cível de mesmo número (2ª Câmara de Direito Público do Tribunal de Justiça de Santa Catarina) e do incidente n. 5049926-11.2026.8.24.0000, em especial: (i) a manifestação de 22/01/2025 e os documentos que a acompanharam (Evento 257 dos autos de origem); (ii) o recurso de apelação interposto em 11/05/2026 e os documentos que o instruem (Evento 280 dos autos de origem); (iii) a petição inicial e as demais manifestações do incidente n. 5049926-11.2026.8.24.0000 (junho de 2026); (iv) os memoriais apresentados em 14/08/2026 (Evento 17 da Apelação Cível); (v) as diligências realizadas em 02/09/2026 perante a Seção de Custas Judiciais do Tribunal de Justiça de Santa Catarina, a emissão da guia de preparo recursal (Eventos 31 e 32 da Apelação Cível) e o seu recolhimento, realizado na mesma data; e (vi) a petição de cumprimento do despacho do Evento 25 da Apelação Cível, que este instrumento acompanha. Declara que tais atos foram praticados por sua determinação e no seu interesse, que a eles jamais se opôs e que a presente ratificação, expressa, retroage à data de cada ato (Código Civil, art. 662, parágrafo único).</w:t>
       </w:r>
     </w:p>
     <w:p>
@@ -211,7 +211,7 @@
           <w:sz w:val="24"/>
           <w:szCs w:val="24"/>
         </w:rPr>
-        <w:t xml:space="preserve">A OUTORGANTE declara que seu administrador, investido da representação ativa e passiva, judicial e extrajudicial, da sociedade (Sétima Alteração Contratual, Cláusula Quinta), tem poderes para constituir mandatários nos limites dessa atribuição (Código Civil, art. 1.018) e que a coincidência entre a pessoa natural do administrador que a representa neste instrumento e a do OUTORGADO é de seu pleno conhecimento e por ela expressamente autorizada (Código Civil, art. 117), sendo a parte nos processos referidos a própria sociedade. O OUTORGADO aceita o mandato.</w:t>
+        <w:t xml:space="preserve">A OUTORGANTE declara que seu administrador, investido da representação ativa e passiva, judicial e extrajudicial, da sociedade (Sétima Alteração Contratual, Cláusula Quinta), tem poderes para constituir mandatários nos limites dessa atribuição (Código Civil, art. 1.018) e que a coincidência entre a pessoa natural do administrador que a representa neste instrumento e a do OUTORGADO é de seu pleno conhecimento e por ela expressamente autorizada (Código Civil, art. 117), por reputá-la de seu exclusivo interesse, sendo a própria sociedade — e não o administrador — a parte nos processos referidos. O OUTORGADO aceita o mandato.</w:t>
       </w:r>
     </w:p>
     <w:p>
@@ -293,7 +293,7 @@
           <w:sz w:val="24"/>
           <w:szCs w:val="24"/>
         </w:rPr>
-        <w:t xml:space="preserve">pela OUTORGANTE: Gabriel Fabrizio do Espírito Santo — sócio administrador — CPF 544.074.601-30</w:t>
+        <w:t xml:space="preserve">pela OUTORGANTE: Gabriel Fabrizio do Espírito Santo — sócio único e administrador — CPF 544.074.601-30</w:t>
       </w:r>
     </w:p>
     <w:p>

</xml_diff>

<commit_message>
ACP 0900193-90: v11 — procuração autoriza (não ratifica) a petição que acompanha; marcador do Doc. 1 completo; laudos de consolidação
Co-Authored-By: Claude Fable 5.1 <noreply@anthropic.com>
Claude-Session: https://claude.ai/code/session_01CCVbA1mc4UdnaFNsukuTYT
</commit_message>
<xml_diff>
--- a/juridico/ACP-0900193-90.2016.8.24.0064/2026-09-02-cumprimento-ev25/pecas/02-procuracao-ad-judicia.docx
+++ b/juridico/ACP-0900193-90.2016.8.24.0064/2026-09-02-cumprimento-ev25/pecas/02-procuracao-ad-judicia.docx
@@ -65,7 +65,7 @@
           <w:sz w:val="24"/>
           <w:szCs w:val="24"/>
         </w:rPr>
-        <w:t xml:space="preserve"> GABRIEL FABRÍZIO DO ESPÍRITO SANTO (grafado "Gabriel Fabrizio do Espírito Santo" no contrato social e nos documentos civis), brasileiro, divorciado, advogado inscrito na Ordem dos Advogados do Brasil, Seção de Santa Catarina, sob o n. 53.040, CPF 544.074.601-30, com escritório profissional na Rua Angelita Figueiredo, n. 1.596, Sala 1004, Torre B, Bairro Areias, São José/SC, CEP 88.113-710, endereço eletrônico gfdoes@gmail.com, telefone (48) 98421-6664.</w:t>
+        <w:t xml:space="preserve"> GABRIEL FABRÍZIO DO ESPÍRITO SANTO (grafado "Gabriel Fabrizio do Espírito Santo" no contrato social), brasileiro, divorciado, advogado inscrito na Ordem dos Advogados do Brasil, Seção de Santa Catarina, sob o n. 53.040, CPF 544.074.601-30, com escritório profissional na Rua Angelita Figueiredo, n. 1.596, Sala 1004, Torre B, Bairro Areias, São José/SC, CEP 88.113-710, endereço eletrônico gfdoes@gmail.com, telefone (48) 98421-6664.</w:t>
       </w:r>
     </w:p>
     <w:p>
@@ -179,7 +179,7 @@
           <w:sz w:val="24"/>
           <w:szCs w:val="24"/>
         </w:rPr>
-        <w:t xml:space="preserve">Em reforço, e para que não paire dúvida quanto à cadeia de representação, a OUTORGANTE ratifica expressamente, para todos os fins de direito (Código Civil, art. 662, parágrafo único), todos os atos, processuais e extraprocessuais, praticados em seu nome e no seu interesse pelo OUTORGADO, até a data deste instrumento, nos autos da Ação Civil Pública n. 0900193-90.2016.8.24.0064 (Vara da Fazenda Pública da Comarca de São José/SC), da Apelação Cível de mesmo número (2ª Câmara de Direito Público do Tribunal de Justiça de Santa Catarina) e do incidente n. 5049926-11.2026.8.24.0000, em especial: (i) a manifestação de 22/01/2025 e os documentos que a acompanharam (Evento 257 dos autos de origem); (ii) o recurso de apelação interposto em 11/05/2026 e os documentos que o instruem (Evento 280 dos autos de origem); (iii) a petição inicial e as demais manifestações do incidente n. 5049926-11.2026.8.24.0000 (junho de 2026); (iv) os memoriais apresentados em 14/08/2026 (Evento 17 da Apelação Cível); (v) as diligências realizadas em 02/09/2026 perante a Seção de Custas Judiciais do Tribunal de Justiça de Santa Catarina, a emissão da guia de preparo recursal (Eventos 31 e 32 da Apelação Cível) e o seu recolhimento, realizado na mesma data; e (vi) a petição de cumprimento do despacho do Evento 25 da Apelação Cível, que este instrumento acompanha. Declara que tais atos foram praticados por sua determinação e no seu interesse, que a eles jamais se opôs e que a presente ratificação, expressa, retroage à data de cada ato (Código Civil, art. 662, parágrafo único).</w:t>
+        <w:t xml:space="preserve">Em reforço, e para que não paire dúvida quanto à cadeia de representação, a OUTORGANTE ratifica expressamente, para todos os fins de direito (Código Civil, art. 662, parágrafo único), todos os atos, processuais e extraprocessuais, praticados em seu nome e no seu interesse pelo OUTORGADO, até a data deste instrumento, nos autos da Ação Civil Pública n. 0900193-90.2016.8.24.0064 (Vara da Fazenda Pública da Comarca de São José/SC), da Apelação Cível de mesmo número (2ª Câmara de Direito Público do Tribunal de Justiça de Santa Catarina) e do incidente n. 5049926-11.2026.8.24.0000, em especial: (i) a manifestação de 22/01/2025 e os documentos que a acompanharam (Evento 257 dos autos de origem); (ii) o recurso de apelação interposto em 11/05/2026 e os documentos que o instruem (Evento 280 dos autos de origem); (iii) a petição inicial e as demais manifestações do incidente n. 5049926-11.2026.8.24.0000 (junho de 2026); (iv) os memoriais apresentados em 14/08/2026 (Evento 17 da Apelação Cível); (v) as diligências realizadas em 02/09/2026 perante a Seção de Custas Judiciais do Tribunal de Justiça de Santa Catarina, a emissão da guia de preparo recursal (Eventos 31 e 32 da Apelação Cível) e o seu recolhimento, realizado na mesma data. Autoriza expressamente, ainda, a apresentação da petição de cumprimento do despacho do Evento 25 da Apelação Cível, que este instrumento acompanha, com os requerimentos nela formulados, inclusive a desistência do requerimento de gratuidade da justiça. Declara que os atos ratificados foram praticados por sua determinação e no seu interesse, que a eles jamais se opôs e que a presente ratificação, expressa, retroage à data de cada ato (Código Civil, art. 662, parágrafo único).</w:t>
       </w:r>
     </w:p>
     <w:p>
@@ -294,6 +294,22 @@
           <w:szCs w:val="24"/>
         </w:rPr>
         <w:t xml:space="preserve">pela OUTORGANTE: Gabriel Fabrizio do Espírito Santo — sócio único e administrador — CPF 544.074.601-30</w:t>
+      </w:r>
+    </w:p>
+    <w:p>
+      <w:pPr>
+        <w:keepNext/>
+        <w:keepLines/>
+        <w:spacing w:after="120" w:line="360"/>
+        <w:jc w:val="center"/>
+      </w:pPr>
+      <w:r>
+        <w:rPr>
+          <w:rFonts w:ascii="Times New Roman" w:cs="Times New Roman" w:eastAsia="Times New Roman" w:hAnsi="Times New Roman"/>
+          <w:sz w:val="24"/>
+          <w:szCs w:val="24"/>
+        </w:rPr>
+        <w:t xml:space="preserve">(assinatura digital com certificado ICP-Brasil da outorgante — CPC, art. 105, § 1º)</w:t>
       </w:r>
     </w:p>
     <w:p>

</xml_diff>